<commit_message>
Proofread the report and fix the notebook, which did not run
The notebook was broken: cell sources were split without keeping their newlines, so all
17 code cells collapsed onto one line and the first raised SyntaxError. Rebuilt via
src/56_build_notebook.py and executed end to end — 8 code cells, 0 errors, outputs match
the report.

Report fixes: markdown bold and code spans were leaking into the Word text and tables;
the candidate count read 139 where 174 092/1 260 is 138; a channel name did not match the
source data; and the FEAT_THR and absolute-seconds sweeps are now marked as indicative
rather than conclusive, because they were measured before the target definition was
corrected.

Co-Authored-By: Claude Opus 5 <noreply@anthropic.com>
</commit_message>
<xml_diff>
--- a/report/shermatova_tansuluu_exam_report.docx
+++ b/report/shermatova_tansuluu_exam_report.docx
@@ -183,7 +183,7 @@
         <w:rPr>
           <w:i w:val="0"/>
         </w:rPr>
-        <w:t>A view is matched to a programme when both share a channel and their intervals overlap. frac = overlap / programme duration, which cannot exceed 1.0 because the overlap is capped by the programme itself. An event enters a user's history when frac ≥ 0.20. That threshold was swept and is optimal: 0.10 and 0.35 are both worse on both hold-outs, and an absolute-seconds rule (≥ 300 s, ≥ 600 s) loses by 0.009 and 0.015 — five minutes of a fifteen-minute bulletin is a third of it, five minutes of a two-hour film is the titles. src/01_join.py, src/lib.py.</w:t>
+        <w:t>A view is matched to a programme when both share a channel and their intervals overlap. frac = overlap / programme duration, which cannot exceed 1.0 because the overlap is capped by the programme itself. An event enters a user's history when frac ≥ 0.20. That threshold was swept and 0.10 and 0.35 were both worse, as was an absolute-seconds rule by 0.009 and 0.015 — five minutes of a fifteen-minute bulletin is a third of it, five minutes of a two-hour film is the titles. Those sweeps were run before the target definition was corrected (Section 5), so they are indicative rather than conclusive; the threshold was left at 0.20 and not re-swept afterwards. src/01_join.py, src/lib.py.</w:t>
       </w:r>
     </w:p>
     <w:p>
@@ -225,7 +225,7 @@
         <w:rPr>
           <w:i w:val="0"/>
         </w:rPr>
-        <w:t>Each user's own watched programmes plus the 80 globally most popular, about 139 candidates per user, 174 092 rows for the 1 260 test users. The pool is identical for every method compared in this report. Recommending an already-watched programme is allowed and is in fact the strongest single signal: repeats alone, weighted by how often the programme airs in the target window, score 0.37471 of the final 0.43949.</w:t>
+        <w:t>Each user's own watched programmes plus the 80 globally most popular, about 138 candidates per user, 174 092 rows for the 1 260 test users. The pool is identical for every method compared in this report. Recommending an already-watched programme is allowed and is in fact the strongest single signal: repeats alone, weighted by how often the programme airs in the target window, score 0.37471 against the full model's 0.43949.</w:t>
       </w:r>
     </w:p>
     <w:p>
@@ -528,7 +528,7 @@
               <w:rPr>
                 <w:sz w:val="18"/>
               </w:rPr>
-              <w:t>139; 174 092</w:t>
+              <w:t>138; 174 092</w:t>
             </w:r>
           </w:p>
         </w:tc>
@@ -649,7 +649,7 @@
           <w:b/>
           <w:sz w:val="19"/>
         </w:rPr>
-        <w:t>Table 2. Methods on the hold-out, scored against the organisers' target. Each method ranks the same 139 candidates per user.</w:t>
+        <w:t>Table 2. Methods on the hold-out, scored against the organisers' target. Each method ranks the same 138 candidates per user.</w:t>
       </w:r>
     </w:p>
     <w:tbl>
@@ -1513,7 +1513,7 @@
               <w:rPr>
                 <w:sz w:val="18"/>
               </w:rPr>
-              <w:t>2400480 ТСН. Неделя [Инфо]; 240081 Факты. День [Инфо] ✓; 2400467 Вікна-Новини [Инфо]; 2400508 Сегодня. Итоги [Инфо]; 6500479 Мир наизнанку [Познав.]</w:t>
+              <w:t>2400480 ТСН. Неделя [Инфо]; 240081 Факты. День [Инфо] ✓; 2400467 Викна-Новости [Инфо]; 2400508 Сегодня. Итоги [Инфо]; 6500479 Мир наизнанку [Познав.]</w:t>
             </w:r>
           </w:p>
         </w:tc>
@@ -2890,7 +2890,7 @@
         <w:rPr>
           <w:i w:val="0"/>
         </w:rPr>
-        <w:t xml:space="preserve"> `|R| = 5` for 90.9% of users, so the metric's denominator `min(5, |R|)` is fixed. There is no long tail to recall: the task is to name a small, closed set of habitual, fully-watched programmes.</w:t>
+        <w:t xml:space="preserve"> |R| = 5 for 90.9% of users, so the metric's denominator min(5, |R|) is fixed. There is no long tail to recall: the task is to name a small, closed set of habitual, fully-watched programmes.</w:t>
       </w:r>
     </w:p>
     <w:p>
@@ -3296,7 +3296,7 @@
               <w:rPr>
                 <w:sz w:val="18"/>
               </w:rPr>
-              <w:t>**final ranker**</w:t>
+              <w:t>final ranker</w:t>
             </w:r>
           </w:p>
         </w:tc>
@@ -3313,7 +3313,7 @@
               <w:rPr>
                 <w:sz w:val="18"/>
               </w:rPr>
-              <w:t>**1/5**</w:t>
+              <w:t>1/5</w:t>
             </w:r>
           </w:p>
         </w:tc>
@@ -3330,7 +3330,7 @@
               <w:rPr>
                 <w:sz w:val="18"/>
               </w:rPr>
-              <w:t>**3/5**</w:t>
+              <w:t>3/5</w:t>
             </w:r>
           </w:p>
         </w:tc>
@@ -3348,7 +3348,7 @@
         <w:rPr>
           <w:i w:val="0"/>
         </w:rPr>
-        <w:t xml:space="preserve"> That inversion is not a defect; it follows from the target. For a sparse viewer the five most frequent programmes simply *are* the mass-audience bulletins, and popularity names them. For a viewer with 445 programmes in their repertoire, naming which five top their frequency list is a fine-grained ordering problem, and every method here finds one of them.</w:t>
+        <w:t xml:space="preserve"> That inversion is not a defect; it follows from the target. For a sparse viewer the five most frequent programmes simply are the mass-audience bulletins, and popularity names them. For a viewer with 445 programmes in their repertoire, naming which five top their frequency list is a fine-grained ordering problem, and every method here finds one of them.</w:t>
       </w:r>
     </w:p>
     <w:p>
@@ -3381,7 +3381,7 @@
         <w:rPr>
           <w:i w:val="0"/>
         </w:rPr>
-        <w:t xml:space="preserve"> — the same five ids in the same order, hitting the same one (240081, *Факты. День*) at rank 2. The mechanism is appointment viewing. The heavy user's own history is 538 views of *ТСН. Неделя*, 244 of *Завтрак с 1+1*, 222 of *Факты. День*: daily news on a fixed schedule. Two such programmes are "watched together" mostly because nearly everyone watches both, so the co-view matrix is a popularity matrix with extra steps, and PageRank's diffusion over that graph returns to the same high-degree nodes.</w:t>
+        <w:t xml:space="preserve"> — the same five ids in the same order, hitting the same one (240081, Факты. День) at rank 2. The mechanism is appointment viewing. The heavy user's own history is 538 views of ТСН. Неделя, 244 of Завтрак с 1+1, 222 of Факты. День: daily news on a fixed schedule. Two such programmes are "watched together" mostly because nearly everyone watches both, so the co-view matrix is a popularity matrix with extra steps, and PageRank's diffusion over that graph returns to the same high-degree nodes.</w:t>
       </w:r>
     </w:p>
     <w:p>
@@ -3389,7 +3389,7 @@
         <w:rPr>
           <w:i w:val="0"/>
         </w:rPr>
-        <w:t>This was measured directly rather than inferred: adding the top-20 items of association rules to the candidate pool adds zero new candidates, PageRank zero, content-based four, iALS about zero. On this catalogue those methods do not propose anything popularity has not already proposed. Association rules would capture complementary consumption — what you watch *because* you watched something else — and here there is almost none to capture at the item level.</w:t>
+        <w:t>This was measured directly rather than inferred: adding the top-20 items of association rules to the candidate pool adds zero new candidates, PageRank zero, content-based four, iALS about zero. On this catalogue those methods do not propose anything popularity has not already proposed. Association rules would capture complementary consumption — what you watch because you watched something else — and here there is almost none to capture at the item level.</w:t>
       </w:r>
     </w:p>
     <w:p>
@@ -3403,7 +3403,7 @@
         <w:rPr>
           <w:i w:val="0"/>
         </w:rPr>
-        <w:t xml:space="preserve"> Given one watched film, *Призрак*, it returned five films and series of the same kind. By any editorial standard those are reasonable recommendations. They earn nothing, because the target counts complete viewings that *recur*, and a particular film is not watched five times. Content attributes contribute where the co-view signal is thin — and what they contribute is the wrong kind of relevance for this metric.</w:t>
+        <w:t xml:space="preserve"> Given one watched film, Призрак, it returned five films and series of the same kind. By any editorial standard those are reasonable recommendations. They earn nothing, because the target counts complete viewings that recur, and a particular film is not watched five times. Content attributes contribute where the co-view signal is thin — and what they contribute is the wrong kind of relevance for this metric.</w:t>
       </w:r>
     </w:p>
     <w:p>
@@ -3431,7 +3431,7 @@
         <w:rPr>
           <w:i w:val="0"/>
         </w:rPr>
-        <w:t>, and not by understanding anyone: for a sparse user the target *is* the population mode.</w:t>
+        <w:t>, and not by understanding anyone: for a sparse user the target is the population mode.</w:t>
       </w:r>
     </w:p>
     <w:p>
@@ -3523,7 +3523,7 @@
         <w:rPr>
           <w:i w:val="0"/>
         </w:rPr>
-        <w:t xml:space="preserve"> In weeks 11-20, 115 613 of 1 074 235 schedule rows have `tv_show_id != 0`. The rest is airtime that can be watched but never recommended. Every method compared here is choosing within a tenth of the schedule, by construction and not by a modelling choice that could be tuned away.</w:t>
+        <w:t xml:space="preserve"> In weeks 11-20, 115 613 of 1 074 235 schedule rows have tv_show_id != 0. The rest is airtime that can be watched but never recommended. Every method compared here is choosing within a tenth of the schedule, by construction and not by a modelling choice that could be tuned away.</w:t>
       </w:r>
     </w:p>
     <w:p>

</xml_diff>